<commit_message>
paper summary, work log and PELT
</commit_message>
<xml_diff>
--- a/Notes/Internship_WeeklyLog.docx
+++ b/Notes/Internship_WeeklyLog.docx
@@ -31,7 +31,48 @@
         <w:t>Weekly Work log</w:t>
       </w:r>
     </w:p>
-    <w:p/>
+    <w:p>
+      <w:pPr>
+        <w:jc w:val="center"/>
+        <w:rPr>
+          <w:b/>
+          <w:bCs/>
+          <w:sz w:val="32"/>
+          <w:szCs w:val="32"/>
+        </w:rPr>
+      </w:pPr>
+    </w:p>
+    <w:p>
+      <w:pPr>
+        <w:jc w:val="center"/>
+        <w:rPr>
+          <w:sz w:val="28"/>
+          <w:szCs w:val="28"/>
+        </w:rPr>
+      </w:pPr>
+      <w:hyperlink r:id="rId7" w:history="1">
+        <w:r>
+          <w:rPr>
+            <w:rStyle w:val="Hyperlink"/>
+            <w:sz w:val="28"/>
+            <w:szCs w:val="28"/>
+          </w:rPr>
+          <w:t>GitHub Repository</w:t>
+        </w:r>
+      </w:hyperlink>
+      <w:r>
+        <w:rPr>
+          <w:sz w:val="28"/>
+          <w:szCs w:val="28"/>
+        </w:rPr>
+        <w:t xml:space="preserve"> (with full code)</w:t>
+      </w:r>
+    </w:p>
+    <w:p>
+      <w:r>
+        <w:tab/>
+      </w:r>
+    </w:p>
     <w:p/>
     <w:p/>
     <w:p>
@@ -604,7 +645,7 @@
                     <pic:cNvPicPr/>
                   </pic:nvPicPr>
                   <pic:blipFill>
-                    <a:blip r:embed="rId7"/>
+                    <a:blip r:embed="rId8"/>
                     <a:stretch>
                       <a:fillRect/>
                     </a:stretch>
@@ -655,7 +696,7 @@
                     <pic:cNvPicPr/>
                   </pic:nvPicPr>
                   <pic:blipFill>
-                    <a:blip r:embed="rId8"/>
+                    <a:blip r:embed="rId9"/>
                     <a:stretch>
                       <a:fillRect/>
                     </a:stretch>
@@ -720,7 +761,7 @@
                     <pic:cNvPicPr/>
                   </pic:nvPicPr>
                   <pic:blipFill>
-                    <a:blip r:embed="rId9"/>
+                    <a:blip r:embed="rId10"/>
                     <a:stretch>
                       <a:fillRect/>
                     </a:stretch>
@@ -783,7 +824,7 @@
                     <pic:cNvPicPr/>
                   </pic:nvPicPr>
                   <pic:blipFill rotWithShape="1">
-                    <a:blip r:embed="rId10"/>
+                    <a:blip r:embed="rId11"/>
                     <a:srcRect l="665" t="2132" b="3009"/>
                     <a:stretch>
                       <a:fillRect/>
@@ -2032,7 +2073,7 @@
           <w:noProof/>
         </w:rPr>
         <w:drawing>
-          <wp:inline distT="0" distB="0" distL="0" distR="0" wp14:anchorId="72C2F619" wp14:editId="03EF8D8D">
+          <wp:inline distT="0" distB="0" distL="0" distR="0" wp14:anchorId="72C2F619" wp14:editId="4F7E7071">
             <wp:extent cx="1772044" cy="2008199"/>
             <wp:effectExtent l="0" t="0" r="6350" b="0"/>
             <wp:docPr id="1009017400" name="Picture 2" descr="A screenshot of a computer&#10;&#10;AI-generated content may be incorrect."/>
@@ -2047,7 +2088,7 @@
                     <pic:cNvPicPr/>
                   </pic:nvPicPr>
                   <pic:blipFill rotWithShape="1">
-                    <a:blip r:embed="rId11" cstate="print">
+                    <a:blip r:embed="rId12" cstate="print">
                       <a:extLst>
                         <a:ext uri="{28A0092B-C50C-407E-A947-70E740481C1C}">
                           <a14:useLocalDpi xmlns:a14="http://schemas.microsoft.com/office/drawing/2010/main" val="0"/>
@@ -2090,7 +2131,7 @@
           <w:noProof/>
         </w:rPr>
         <w:drawing>
-          <wp:inline distT="0" distB="0" distL="0" distR="0" wp14:anchorId="2BBAB80E" wp14:editId="5E808808">
+          <wp:inline distT="0" distB="0" distL="0" distR="0" wp14:anchorId="2BBAB80E" wp14:editId="6BB3101F">
             <wp:extent cx="1816188" cy="2020752"/>
             <wp:effectExtent l="0" t="0" r="0" b="0"/>
             <wp:docPr id="1887858616" name="Picture 3" descr="A screenshot of a computer&#10;&#10;AI-generated content may be incorrect."/>
@@ -2105,7 +2146,7 @@
                     <pic:cNvPicPr/>
                   </pic:nvPicPr>
                   <pic:blipFill rotWithShape="1">
-                    <a:blip r:embed="rId12" cstate="print">
+                    <a:blip r:embed="rId13" cstate="print">
                       <a:extLst>
                         <a:ext uri="{28A0092B-C50C-407E-A947-70E740481C1C}">
                           <a14:useLocalDpi xmlns:a14="http://schemas.microsoft.com/office/drawing/2010/main" val="0"/>
@@ -2148,7 +2189,7 @@
           <w:noProof/>
         </w:rPr>
         <w:drawing>
-          <wp:inline distT="0" distB="0" distL="0" distR="0" wp14:anchorId="7B94EE15" wp14:editId="573D1CA3">
+          <wp:inline distT="0" distB="0" distL="0" distR="0" wp14:anchorId="7B94EE15" wp14:editId="51F98012">
             <wp:extent cx="1969332" cy="2004790"/>
             <wp:effectExtent l="0" t="0" r="0" b="1905"/>
             <wp:docPr id="704762316" name="Picture 4" descr="A screenshot of a computer&#10;&#10;AI-generated content may be incorrect."/>
@@ -2163,7 +2204,7 @@
                     <pic:cNvPicPr/>
                   </pic:nvPicPr>
                   <pic:blipFill rotWithShape="1">
-                    <a:blip r:embed="rId13" cstate="print">
+                    <a:blip r:embed="rId14" cstate="print">
                       <a:extLst>
                         <a:ext uri="{28A0092B-C50C-407E-A947-70E740481C1C}">
                           <a14:useLocalDpi xmlns:a14="http://schemas.microsoft.com/office/drawing/2010/main" val="0"/>
@@ -3358,7 +3399,7 @@
                     <pic:cNvPicPr/>
                   </pic:nvPicPr>
                   <pic:blipFill>
-                    <a:blip r:embed="rId14"/>
+                    <a:blip r:embed="rId15"/>
                     <a:stretch>
                       <a:fillRect/>
                     </a:stretch>
@@ -3516,28 +3557,7 @@
           <w:b/>
           <w:bCs/>
         </w:rPr>
-        <w:t xml:space="preserve">Week </w:t>
-      </w:r>
-      <w:r>
-        <w:rPr>
-          <w:b/>
-          <w:bCs/>
-        </w:rPr>
-        <w:t>5</w:t>
-      </w:r>
-      <w:r>
-        <w:rPr>
-          <w:b/>
-          <w:bCs/>
-        </w:rPr>
-        <w:t xml:space="preserve"> (</w:t>
-      </w:r>
-      <w:r>
-        <w:rPr>
-          <w:b/>
-          <w:bCs/>
-        </w:rPr>
-        <w:t>16</w:t>
+        <w:t>Week 5 (16</w:t>
       </w:r>
       <w:r>
         <w:rPr>
@@ -3552,14 +3572,7 @@
           <w:b/>
           <w:bCs/>
         </w:rPr>
-        <w:t xml:space="preserve"> Feb – </w:t>
-      </w:r>
-      <w:r>
-        <w:rPr>
-          <w:b/>
-          <w:bCs/>
-        </w:rPr>
-        <w:t>20</w:t>
+        <w:t xml:space="preserve"> Feb – 20</w:t>
       </w:r>
       <w:r>
         <w:rPr>
@@ -3608,7 +3621,13 @@
         </w:numPr>
       </w:pPr>
       <w:r>
-        <w:t>Features present:</w:t>
+        <w:t>Features present</w:t>
+      </w:r>
+      <w:r>
+        <w:t xml:space="preserve"> in first version of GUI</w:t>
+      </w:r>
+      <w:r>
+        <w:t>:</w:t>
       </w:r>
     </w:p>
     <w:p>
@@ -3674,7 +3693,10 @@
         </w:numPr>
       </w:pPr>
       <w:r>
-        <w:t>Additional features to add</w:t>
+        <w:t xml:space="preserve">Additional </w:t>
+      </w:r>
+      <w:r>
+        <w:t>features added</w:t>
       </w:r>
     </w:p>
     <w:p>
@@ -3686,7 +3708,7 @@
         </w:numPr>
       </w:pPr>
       <w:r>
-        <w:t>The switch from rehab back to wearing needs to be checked fixed.</w:t>
+        <w:t xml:space="preserve">Positions and velocities of each joint and end effector are logged. </w:t>
       </w:r>
     </w:p>
     <w:p>
@@ -3698,7 +3720,126 @@
         </w:numPr>
       </w:pPr>
       <w:r>
-        <w:t>Display and data logging of all joints.</w:t>
+        <w:t xml:space="preserve">Joint data is recorded at a frequency of 50 Hz. </w:t>
+      </w:r>
+    </w:p>
+    <w:p>
+      <w:pPr>
+        <w:pStyle w:val="ListParagraph"/>
+        <w:numPr>
+          <w:ilvl w:val="1"/>
+          <w:numId w:val="11"/>
+        </w:numPr>
+      </w:pPr>
+      <w:r>
+        <w:t>Freeze display that momentarily stops rapidly updating the display data to observe and note down joint positions and velocities at a time instant.</w:t>
+      </w:r>
+    </w:p>
+    <w:p>
+      <w:pPr>
+        <w:pStyle w:val="ListParagraph"/>
+        <w:numPr>
+          <w:ilvl w:val="1"/>
+          <w:numId w:val="11"/>
+        </w:numPr>
+      </w:pPr>
+      <w:r>
+        <w:t xml:space="preserve">Record all data mode: </w:t>
+      </w:r>
+      <w:r>
+        <w:t>Data logging of</w:t>
+      </w:r>
+      <w:r>
+        <w:t xml:space="preserve"> both </w:t>
+      </w:r>
+      <w:r>
+        <w:t xml:space="preserve">all </w:t>
+      </w:r>
+      <w:r>
+        <w:t xml:space="preserve">joint angles and </w:t>
+      </w:r>
+      <w:r>
+        <w:t>positions, left and right.</w:t>
+      </w:r>
+    </w:p>
+    <w:p>
+      <w:pPr>
+        <w:pStyle w:val="ListParagraph"/>
+        <w:numPr>
+          <w:ilvl w:val="1"/>
+          <w:numId w:val="11"/>
+        </w:numPr>
+      </w:pPr>
+      <w:proofErr w:type="spellStart"/>
+      <w:r>
+        <w:t>Monolateral</w:t>
+      </w:r>
+      <w:proofErr w:type="spellEnd"/>
+      <w:r>
+        <w:t xml:space="preserve"> acquisition mode: (Designed for </w:t>
+      </w:r>
+      <w:r>
+        <w:t xml:space="preserve">labelled </w:t>
+      </w:r>
+      <w:r>
+        <w:t xml:space="preserve">training data collection) </w:t>
+      </w:r>
+    </w:p>
+    <w:p>
+      <w:pPr>
+        <w:pStyle w:val="ListParagraph"/>
+        <w:numPr>
+          <w:ilvl w:val="2"/>
+          <w:numId w:val="11"/>
+        </w:numPr>
+      </w:pPr>
+      <w:r>
+        <w:t>Choice of arm (left or right) and logs data only from chosen arm.</w:t>
+      </w:r>
+    </w:p>
+    <w:p>
+      <w:pPr>
+        <w:pStyle w:val="ListParagraph"/>
+        <w:numPr>
+          <w:ilvl w:val="2"/>
+          <w:numId w:val="11"/>
+        </w:numPr>
+      </w:pPr>
+      <w:r>
+        <w:t xml:space="preserve">Once data collection is started, the user performs the experiment and </w:t>
+      </w:r>
+      <w:r>
+        <w:t xml:space="preserve">as the user reaches a change of state, they press the “Next State” button on the GUI. </w:t>
+      </w:r>
+    </w:p>
+    <w:p>
+      <w:pPr>
+        <w:pStyle w:val="ListParagraph"/>
+        <w:numPr>
+          <w:ilvl w:val="2"/>
+          <w:numId w:val="11"/>
+        </w:numPr>
+      </w:pPr>
+      <w:r>
+        <w:t xml:space="preserve">In this way, the data </w:t>
+      </w:r>
+      <w:r>
+        <w:t>records</w:t>
+      </w:r>
+      <w:r>
+        <w:t xml:space="preserve"> a label of the </w:t>
+      </w:r>
+      <w:r>
+        <w:t>subtask</w:t>
+      </w:r>
+      <w:r>
+        <w:t xml:space="preserve"> and </w:t>
+      </w:r>
+      <w:r>
+        <w:t>its start and end points</w:t>
+      </w:r>
+      <w:r>
+        <w:t>.</w:t>
       </w:r>
     </w:p>
     <w:p>
@@ -3706,6 +3847,182 @@
         <w:pStyle w:val="ListParagraph"/>
         <w:ind w:left="1440"/>
       </w:pPr>
+    </w:p>
+    <w:p>
+      <w:pPr>
+        <w:rPr>
+          <w:b/>
+          <w:bCs/>
+        </w:rPr>
+      </w:pPr>
+      <w:r>
+        <w:rPr>
+          <w:b/>
+          <w:bCs/>
+        </w:rPr>
+        <w:t>Recording Data:</w:t>
+      </w:r>
+    </w:p>
+    <w:p>
+      <w:pPr>
+        <w:pStyle w:val="ListParagraph"/>
+        <w:numPr>
+          <w:ilvl w:val="0"/>
+          <w:numId w:val="13"/>
+        </w:numPr>
+      </w:pPr>
+      <w:r>
+        <w:t xml:space="preserve">Recorded 30 repetitions of a </w:t>
+      </w:r>
+      <w:proofErr w:type="gramStart"/>
+      <w:r>
+        <w:t>point to point</w:t>
+      </w:r>
+      <w:proofErr w:type="gramEnd"/>
+      <w:r>
+        <w:t xml:space="preserve"> task using </w:t>
+      </w:r>
+      <w:proofErr w:type="spellStart"/>
+      <w:r>
+        <w:t>ALExRS</w:t>
+      </w:r>
+      <w:proofErr w:type="spellEnd"/>
+      <w:r>
+        <w:t>.</w:t>
+      </w:r>
+    </w:p>
+    <w:p>
+      <w:pPr>
+        <w:pStyle w:val="ListParagraph"/>
+        <w:numPr>
+          <w:ilvl w:val="0"/>
+          <w:numId w:val="13"/>
+        </w:numPr>
+      </w:pPr>
+      <w:r>
+        <w:t xml:space="preserve">Task: </w:t>
+      </w:r>
+    </w:p>
+    <w:p>
+      <w:pPr>
+        <w:pStyle w:val="ListParagraph"/>
+        <w:numPr>
+          <w:ilvl w:val="1"/>
+          <w:numId w:val="13"/>
+        </w:numPr>
+      </w:pPr>
+      <w:r>
+        <w:t>S</w:t>
+      </w:r>
+      <w:r>
+        <w:t>tart from neutral position with hands on the side of the torso. (IDLE)</w:t>
+      </w:r>
+    </w:p>
+    <w:p>
+      <w:pPr>
+        <w:pStyle w:val="ListParagraph"/>
+        <w:numPr>
+          <w:ilvl w:val="1"/>
+          <w:numId w:val="13"/>
+        </w:numPr>
+      </w:pPr>
+      <w:r>
+        <w:lastRenderedPageBreak/>
+        <w:t>Move to a fixed point at a defined location forward and upward</w:t>
+      </w:r>
+      <w:r>
+        <w:t xml:space="preserve"> (GOING)</w:t>
+      </w:r>
+    </w:p>
+    <w:p>
+      <w:pPr>
+        <w:pStyle w:val="ListParagraph"/>
+        <w:numPr>
+          <w:ilvl w:val="1"/>
+          <w:numId w:val="13"/>
+        </w:numPr>
+      </w:pPr>
+      <w:r>
+        <w:t>Return to neutral position (RETURNING)</w:t>
+      </w:r>
+    </w:p>
+    <w:p>
+      <w:pPr>
+        <w:pStyle w:val="ListParagraph"/>
+        <w:numPr>
+          <w:ilvl w:val="0"/>
+          <w:numId w:val="13"/>
+        </w:numPr>
+      </w:pPr>
+      <w:r>
+        <w:t>At each time step</w:t>
+      </w:r>
+      <w:r>
+        <w:t>, the state</w:t>
+      </w:r>
+      <w:r>
+        <w:t xml:space="preserve"> </w:t>
+      </w:r>
+      <w:r>
+        <w:t>(</w:t>
+      </w:r>
+      <w:r>
+        <w:t xml:space="preserve">IDLE, GOING </w:t>
+      </w:r>
+      <w:r>
+        <w:t>or</w:t>
+      </w:r>
+      <w:r>
+        <w:t xml:space="preserve"> RETURNING</w:t>
+      </w:r>
+      <w:r>
+        <w:t>)</w:t>
+      </w:r>
+      <w:r>
+        <w:t xml:space="preserve"> </w:t>
+      </w:r>
+      <w:r>
+        <w:t>is recorded in a csv file along with the joint data.</w:t>
+      </w:r>
+    </w:p>
+    <w:p>
+      <w:pPr>
+        <w:pStyle w:val="ListParagraph"/>
+        <w:numPr>
+          <w:ilvl w:val="0"/>
+          <w:numId w:val="13"/>
+        </w:numPr>
+      </w:pPr>
+      <w:r>
+        <w:t xml:space="preserve">The repetitions were time agnostic: </w:t>
+      </w:r>
+      <w:r>
+        <w:t>the data contained variations in the duration of GOING and RETURNING states</w:t>
+      </w:r>
+      <w:r>
+        <w:t>.</w:t>
+      </w:r>
+    </w:p>
+    <w:p>
+      <w:pPr>
+        <w:pStyle w:val="ListParagraph"/>
+        <w:numPr>
+          <w:ilvl w:val="0"/>
+          <w:numId w:val="13"/>
+        </w:numPr>
+      </w:pPr>
+      <w:r>
+        <w:t xml:space="preserve">The repetitions were path agnostic: the data contained variations in the trajectory </w:t>
+      </w:r>
+      <w:r>
+        <w:t xml:space="preserve">traversed </w:t>
+      </w:r>
+      <w:r>
+        <w:t>between the fixed points</w:t>
+      </w:r>
+      <w:r>
+        <w:t>.</w:t>
+      </w:r>
     </w:p>
     <w:p/>
     <w:p/>
@@ -3721,6 +4038,318 @@
           <w:b/>
           <w:bCs/>
         </w:rPr>
+        <w:t>Week 5 (16</w:t>
+      </w:r>
+      <w:r>
+        <w:rPr>
+          <w:b/>
+          <w:bCs/>
+          <w:vertAlign w:val="superscript"/>
+        </w:rPr>
+        <w:t>th</w:t>
+      </w:r>
+      <w:r>
+        <w:rPr>
+          <w:b/>
+          <w:bCs/>
+        </w:rPr>
+        <w:t xml:space="preserve"> Feb – 20</w:t>
+      </w:r>
+      <w:r>
+        <w:rPr>
+          <w:b/>
+          <w:bCs/>
+          <w:vertAlign w:val="superscript"/>
+        </w:rPr>
+        <w:t>th</w:t>
+      </w:r>
+      <w:r>
+        <w:rPr>
+          <w:b/>
+          <w:bCs/>
+        </w:rPr>
+        <w:t xml:space="preserve"> Feb)</w:t>
+      </w:r>
+    </w:p>
+    <w:p/>
+    <w:p>
+      <w:pPr>
+        <w:pStyle w:val="ListParagraph"/>
+        <w:numPr>
+          <w:ilvl w:val="0"/>
+          <w:numId w:val="14"/>
+        </w:numPr>
+      </w:pPr>
+      <w:r>
+        <w:rPr>
+          <w:b/>
+          <w:bCs/>
+        </w:rPr>
+        <w:t>Reading the papers</w:t>
+      </w:r>
+      <w:r>
+        <w:rPr>
+          <w:b/>
+          <w:bCs/>
+        </w:rPr>
+        <w:t xml:space="preserve"> provided</w:t>
+      </w:r>
+      <w:r>
+        <w:t xml:space="preserve">: Summary and notes </w:t>
+      </w:r>
+      <w:hyperlink r:id="rId16" w:history="1">
+        <w:r>
+          <w:rPr>
+            <w:rStyle w:val="Hyperlink"/>
+          </w:rPr>
+          <w:t>here</w:t>
+        </w:r>
+      </w:hyperlink>
+    </w:p>
+    <w:p>
+      <w:pPr>
+        <w:pStyle w:val="ListParagraph"/>
+        <w:numPr>
+          <w:ilvl w:val="0"/>
+          <w:numId w:val="14"/>
+        </w:numPr>
+      </w:pPr>
+      <w:r>
+        <w:rPr>
+          <w:b/>
+          <w:bCs/>
+        </w:rPr>
+        <w:t xml:space="preserve">Implementing </w:t>
+      </w:r>
+      <w:r>
+        <w:rPr>
+          <w:b/>
+          <w:bCs/>
+        </w:rPr>
+        <w:t xml:space="preserve">PELT </w:t>
+      </w:r>
+      <w:r>
+        <w:rPr>
+          <w:b/>
+          <w:bCs/>
+        </w:rPr>
+        <w:t>change point detection algorithm on python:</w:t>
+      </w:r>
+    </w:p>
+    <w:p>
+      <w:pPr>
+        <w:pStyle w:val="ListParagraph"/>
+        <w:numPr>
+          <w:ilvl w:val="1"/>
+          <w:numId w:val="14"/>
+        </w:numPr>
+      </w:pPr>
+      <w:r>
+        <w:t>D</w:t>
+      </w:r>
+      <w:r>
+        <w:t xml:space="preserve">etected duplicated and </w:t>
+      </w:r>
+      <w:r>
+        <w:t xml:space="preserve">incorrect </w:t>
+      </w:r>
+      <w:r>
+        <w:t xml:space="preserve">change points during the transition between </w:t>
+      </w:r>
+      <w:r>
+        <w:t>‘going’ and ‘returning’</w:t>
+      </w:r>
+      <w:r>
+        <w:t>.</w:t>
+      </w:r>
+    </w:p>
+    <w:p>
+      <w:pPr>
+        <w:pStyle w:val="ListParagraph"/>
+        <w:numPr>
+          <w:ilvl w:val="1"/>
+          <w:numId w:val="14"/>
+        </w:numPr>
+      </w:pPr>
+      <w:proofErr w:type="spellStart"/>
+      <w:r>
+        <w:rPr>
+          <w:b/>
+          <w:bCs/>
+        </w:rPr>
+        <w:t>Reason</w:t>
+      </w:r>
+      <w:r>
+        <w:t>:</w:t>
+      </w:r>
+      <w:proofErr w:type="spellEnd"/>
+      <w:r>
+        <w:t xml:space="preserve"> I stopped at the target for a few </w:t>
+      </w:r>
+      <w:proofErr w:type="gramStart"/>
+      <w:r>
+        <w:t>seconds</w:t>
+      </w:r>
+      <w:proofErr w:type="gramEnd"/>
+      <w:r>
+        <w:t xml:space="preserve"> and it detected that as a new state</w:t>
+      </w:r>
+      <w:r>
+        <w:t xml:space="preserve"> as the velocity changed from </w:t>
+      </w:r>
+      <w:proofErr w:type="spellStart"/>
+      <w:proofErr w:type="gramStart"/>
+      <w:r>
+        <w:t>non zero</w:t>
+      </w:r>
+      <w:proofErr w:type="spellEnd"/>
+      <w:proofErr w:type="gramEnd"/>
+      <w:r>
+        <w:t xml:space="preserve"> to zero</w:t>
+      </w:r>
+      <w:r>
+        <w:t xml:space="preserve">. </w:t>
+      </w:r>
+    </w:p>
+    <w:p>
+      <w:pPr>
+        <w:pStyle w:val="ListParagraph"/>
+        <w:numPr>
+          <w:ilvl w:val="1"/>
+          <w:numId w:val="14"/>
+        </w:numPr>
+      </w:pPr>
+      <w:r>
+        <w:rPr>
+          <w:b/>
+          <w:bCs/>
+        </w:rPr>
+        <w:t>Solution</w:t>
+      </w:r>
+      <w:r>
+        <w:t>:</w:t>
+      </w:r>
+      <w:r>
+        <w:t xml:space="preserve"> </w:t>
+      </w:r>
+      <w:r>
+        <w:t xml:space="preserve">I removed consecutive zero values in going and returning states </w:t>
+      </w:r>
+      <w:r>
+        <w:t>before applying CPD</w:t>
+      </w:r>
+      <w:r>
+        <w:t xml:space="preserve">. </w:t>
+      </w:r>
+      <w:r>
+        <w:t xml:space="preserve">This altered data is closer to a </w:t>
+      </w:r>
+      <w:proofErr w:type="gramStart"/>
+      <w:r>
+        <w:t>point to point</w:t>
+      </w:r>
+      <w:proofErr w:type="gramEnd"/>
+      <w:r>
+        <w:t xml:space="preserve"> task without the additional </w:t>
+      </w:r>
+      <w:r>
+        <w:t xml:space="preserve">waiting or stationary state. </w:t>
+      </w:r>
+    </w:p>
+    <w:p>
+      <w:pPr>
+        <w:pStyle w:val="ListParagraph"/>
+        <w:numPr>
+          <w:ilvl w:val="1"/>
+          <w:numId w:val="14"/>
+        </w:numPr>
+      </w:pPr>
+      <w:r>
+        <w:rPr>
+          <w:b/>
+          <w:bCs/>
+        </w:rPr>
+        <w:t>Observation</w:t>
+      </w:r>
+      <w:r>
+        <w:t>: T</w:t>
+      </w:r>
+      <w:r>
+        <w:t>he performance improved</w:t>
+      </w:r>
+    </w:p>
+    <w:p>
+      <w:pPr>
+        <w:pStyle w:val="ListParagraph"/>
+        <w:numPr>
+          <w:ilvl w:val="1"/>
+          <w:numId w:val="14"/>
+        </w:numPr>
+      </w:pPr>
+      <w:r>
+        <w:rPr>
+          <w:b/>
+          <w:bCs/>
+        </w:rPr>
+        <w:t>Inference</w:t>
+      </w:r>
+      <w:r>
+        <w:t>:</w:t>
+      </w:r>
+      <w:r>
+        <w:t xml:space="preserve"> </w:t>
+      </w:r>
+      <w:r>
+        <w:rPr>
+          <w:b/>
+          <w:bCs/>
+        </w:rPr>
+        <w:t xml:space="preserve"> </w:t>
+      </w:r>
+      <w:r>
+        <w:t xml:space="preserve">New Data should be collected </w:t>
+      </w:r>
+      <w:r>
+        <w:t xml:space="preserve">without movement breaks between going and returning. Additionally, the state change </w:t>
+      </w:r>
+      <w:r>
+        <w:t xml:space="preserve">signifying the end of the returning state must be recorded. </w:t>
+      </w:r>
+      <w:r>
+        <w:br/>
+        <w:t>Data must have 4 states and 3 change points</w:t>
+      </w:r>
+      <w:r>
+        <w:t xml:space="preserve"> between them</w:t>
+      </w:r>
+      <w:r>
+        <w:t xml:space="preserve">: </w:t>
+      </w:r>
+      <w:r>
+        <w:br/>
+        <w:t>START</w:t>
+      </w:r>
+      <w:r>
+        <w:t xml:space="preserve">, GOING, </w:t>
+      </w:r>
+      <w:r>
+        <w:t>RETURNING, STOP</w:t>
+      </w:r>
+    </w:p>
+    <w:p/>
+    <w:p/>
+    <w:p>
+      <w:pPr>
+        <w:rPr>
+          <w:b/>
+          <w:bCs/>
+        </w:rPr>
+      </w:pPr>
+      <w:r>
+        <w:rPr>
+          <w:b/>
+          <w:bCs/>
+        </w:rPr>
         <w:t xml:space="preserve">PLANNED </w:t>
       </w:r>
       <w:r>
@@ -3743,7 +4372,21 @@
           <w:b/>
           <w:bCs/>
         </w:rPr>
-        <w:t xml:space="preserve">(Based on discussion with Prof. Cordella and Prof Scotto </w:t>
+        <w:t>(Based on discussion</w:t>
+      </w:r>
+      <w:r>
+        <w:rPr>
+          <w:b/>
+          <w:bCs/>
+        </w:rPr>
+        <w:t>s</w:t>
+      </w:r>
+      <w:r>
+        <w:rPr>
+          <w:b/>
+          <w:bCs/>
+        </w:rPr>
+        <w:t xml:space="preserve"> with Prof. Cordella and Prof Scotto </w:t>
       </w:r>
       <w:proofErr w:type="gramStart"/>
       <w:r>
@@ -3759,22 +4402,7 @@
           <w:b/>
           <w:bCs/>
         </w:rPr>
-        <w:t xml:space="preserve"> Luzio on 27</w:t>
-      </w:r>
-      <w:r>
-        <w:rPr>
-          <w:b/>
-          <w:bCs/>
-          <w:vertAlign w:val="superscript"/>
-        </w:rPr>
-        <w:t>th</w:t>
-      </w:r>
-      <w:r>
-        <w:rPr>
-          <w:b/>
-          <w:bCs/>
-        </w:rPr>
-        <w:t xml:space="preserve"> Jan)</w:t>
+        <w:t xml:space="preserve"> Luzio)</w:t>
       </w:r>
     </w:p>
     <w:p>
@@ -3925,6 +4553,21 @@
       <w:r>
         <w:t>Choose a task: mono-lateral, point to point, time agnostic,</w:t>
       </w:r>
+      <w:r>
+        <w:t xml:space="preserve"> </w:t>
+      </w:r>
+      <w:r>
+        <w:rPr>
+          <w:color w:val="00B050"/>
+        </w:rPr>
+        <w:t>(Done</w:t>
+      </w:r>
+      <w:r>
+        <w:rPr>
+          <w:color w:val="00B050"/>
+        </w:rPr>
+        <w:t>)</w:t>
+      </w:r>
     </w:p>
     <w:p>
       <w:pPr>
@@ -3935,7 +4578,28 @@
         </w:numPr>
       </w:pPr>
       <w:r>
-        <w:t>Subtask detection (start and final positions of subtask) in a large complex task</w:t>
+        <w:t>S</w:t>
+      </w:r>
+      <w:r>
+        <w:t xml:space="preserve">elect </w:t>
+      </w:r>
+      <w:r>
+        <w:t>start and final positions of subtask</w:t>
+      </w:r>
+      <w:r>
+        <w:t xml:space="preserve"> </w:t>
+      </w:r>
+      <w:r>
+        <w:t>in a large complex task</w:t>
+      </w:r>
+      <w:r>
+        <w:t xml:space="preserve"> </w:t>
+      </w:r>
+      <w:r>
+        <w:rPr>
+          <w:color w:val="00B050"/>
+        </w:rPr>
+        <w:t xml:space="preserve">(Done) </w:t>
       </w:r>
     </w:p>
     <w:p>
@@ -3947,7 +4611,27 @@
         </w:numPr>
       </w:pPr>
       <w:r>
-        <w:t>Find research papers on these applications.</w:t>
+        <w:t>D</w:t>
+      </w:r>
+      <w:r>
+        <w:t>ata collection</w:t>
+      </w:r>
+      <w:r>
+        <w:t xml:space="preserve"> of multiple repetitions of a </w:t>
+      </w:r>
+      <w:proofErr w:type="gramStart"/>
+      <w:r>
+        <w:t>point to point</w:t>
+      </w:r>
+      <w:proofErr w:type="gramEnd"/>
+      <w:r>
+        <w:t xml:space="preserve"> task </w:t>
+      </w:r>
+      <w:r>
+        <w:rPr>
+          <w:color w:val="00B050"/>
+        </w:rPr>
+        <w:t>(Done)</w:t>
       </w:r>
     </w:p>
     <w:p>
@@ -3959,7 +4643,10 @@
         </w:numPr>
       </w:pPr>
       <w:r>
-        <w:t>After data collection: few shot learning, change point detection for subtask detection.</w:t>
+        <w:t xml:space="preserve">Reading approaches for change point detection </w:t>
+      </w:r>
+      <w:r>
+        <w:t>in Papers given by Prof. Scotto</w:t>
       </w:r>
     </w:p>
     <w:p>
@@ -3971,28 +4658,27 @@
         </w:numPr>
       </w:pPr>
       <w:r>
-        <w:lastRenderedPageBreak/>
-        <w:t xml:space="preserve">Assistance as needed. Based on velocities and torque </w:t>
-      </w:r>
-    </w:p>
-    <w:p>
-      <w:pPr>
-        <w:pStyle w:val="ListParagraph"/>
-      </w:pPr>
-    </w:p>
-    <w:p>
-      <w:pPr>
-        <w:pStyle w:val="ListParagraph"/>
-      </w:pPr>
-    </w:p>
-    <w:p>
-      <w:pPr>
-        <w:pStyle w:val="ListParagraph"/>
-      </w:pPr>
-    </w:p>
-    <w:p>
-      <w:r>
-        <w:t>QUESTION FOR MARCO</w:t>
+        <w:t xml:space="preserve">Implementing </w:t>
+      </w:r>
+      <w:r>
+        <w:t>F</w:t>
+      </w:r>
+      <w:r>
+        <w:t xml:space="preserve">ew </w:t>
+      </w:r>
+      <w:proofErr w:type="gramStart"/>
+      <w:r>
+        <w:t>shot</w:t>
+      </w:r>
+      <w:proofErr w:type="gramEnd"/>
+      <w:r>
+        <w:t xml:space="preserve"> learning, change point detection</w:t>
+      </w:r>
+      <w:r>
+        <w:t xml:space="preserve"> approaches</w:t>
+      </w:r>
+      <w:r>
+        <w:t xml:space="preserve"> for subtask detection.</w:t>
       </w:r>
     </w:p>
     <w:p>
@@ -4004,81 +4690,10 @@
         </w:numPr>
       </w:pPr>
       <w:r>
-        <w:t>Marco’s PC is from the lab or his own?</w:t>
-      </w:r>
-    </w:p>
-    <w:p>
-      <w:pPr>
-        <w:pStyle w:val="ListParagraph"/>
-        <w:numPr>
-          <w:ilvl w:val="0"/>
-          <w:numId w:val="4"/>
-        </w:numPr>
-      </w:pPr>
-      <w:r>
-        <w:t>Compare data collection frequency with my co</w:t>
-      </w:r>
-      <w:r>
-        <w:t>de</w:t>
-      </w:r>
-    </w:p>
-    <w:p>
-      <w:pPr>
-        <w:pStyle w:val="ListParagraph"/>
-        <w:numPr>
-          <w:ilvl w:val="0"/>
-          <w:numId w:val="4"/>
-        </w:numPr>
-      </w:pPr>
-      <w:r>
-        <w:t>Was your bilateral controller impedance or position.</w:t>
+        <w:t xml:space="preserve">Assistance as needed. Based on velocities and torque </w:t>
       </w:r>
     </w:p>
     <w:p/>
-    <w:p/>
-    <w:p>
-      <w:r>
-        <w:t>QUESTION FOR PROF SCOTTO</w:t>
-      </w:r>
-    </w:p>
-    <w:p>
-      <w:pPr>
-        <w:pStyle w:val="ListParagraph"/>
-        <w:numPr>
-          <w:ilvl w:val="0"/>
-          <w:numId w:val="12"/>
-        </w:numPr>
-      </w:pPr>
-      <w:r>
-        <w:t>Two papers change point detection and few shot learning please send.</w:t>
-      </w:r>
-    </w:p>
-    <w:p>
-      <w:pPr>
-        <w:pStyle w:val="ListParagraph"/>
-        <w:numPr>
-          <w:ilvl w:val="0"/>
-          <w:numId w:val="12"/>
-        </w:numPr>
-      </w:pPr>
-      <w:r>
-        <w:t xml:space="preserve">GUI issues and discussion with </w:t>
-      </w:r>
-      <w:r>
-        <w:t>M</w:t>
-      </w:r>
-      <w:r>
-        <w:t>arco</w:t>
-      </w:r>
-      <w:r>
-        <w:t xml:space="preserve">. </w:t>
-      </w:r>
-    </w:p>
-    <w:p>
-      <w:pPr>
-        <w:pStyle w:val="ListParagraph"/>
-      </w:pPr>
-    </w:p>
     <w:p>
       <w:pPr>
         <w:pStyle w:val="ListParagraph"/>
@@ -4285,7 +4900,7 @@
         <w:rFonts w:ascii="Courier New" w:hAnsi="Courier New" w:cs="Courier New" w:hint="default"/>
       </w:rPr>
     </w:lvl>
-    <w:lvl w:ilvl="2" w:tplc="04100005" w:tentative="1">
+    <w:lvl w:ilvl="2" w:tplc="04100005">
       <w:start w:val="1"/>
       <w:numFmt w:val="bullet"/>
       <w:lvlText w:val=""/>
@@ -4710,6 +5325,119 @@
     </w:lvl>
   </w:abstractNum>
   <w:abstractNum w:abstractNumId="5" w15:restartNumberingAfterBreak="0">
+    <w:nsid w:val="283C356B"/>
+    <w:multiLevelType w:val="hybridMultilevel"/>
+    <w:tmpl w:val="25B849A6"/>
+    <w:lvl w:ilvl="0" w:tplc="08090001">
+      <w:start w:val="1"/>
+      <w:numFmt w:val="bullet"/>
+      <w:lvlText w:val=""/>
+      <w:lvlJc w:val="left"/>
+      <w:pPr>
+        <w:ind w:left="720" w:hanging="360"/>
+      </w:pPr>
+      <w:rPr>
+        <w:rFonts w:ascii="Symbol" w:hAnsi="Symbol" w:hint="default"/>
+      </w:rPr>
+    </w:lvl>
+    <w:lvl w:ilvl="1" w:tplc="08090003">
+      <w:start w:val="1"/>
+      <w:numFmt w:val="bullet"/>
+      <w:lvlText w:val="o"/>
+      <w:lvlJc w:val="left"/>
+      <w:pPr>
+        <w:ind w:left="1440" w:hanging="360"/>
+      </w:pPr>
+      <w:rPr>
+        <w:rFonts w:ascii="Courier New" w:hAnsi="Courier New" w:cs="Courier New" w:hint="default"/>
+      </w:rPr>
+    </w:lvl>
+    <w:lvl w:ilvl="2" w:tplc="08090005" w:tentative="1">
+      <w:start w:val="1"/>
+      <w:numFmt w:val="bullet"/>
+      <w:lvlText w:val=""/>
+      <w:lvlJc w:val="left"/>
+      <w:pPr>
+        <w:ind w:left="2160" w:hanging="360"/>
+      </w:pPr>
+      <w:rPr>
+        <w:rFonts w:ascii="Wingdings" w:hAnsi="Wingdings" w:hint="default"/>
+      </w:rPr>
+    </w:lvl>
+    <w:lvl w:ilvl="3" w:tplc="08090001" w:tentative="1">
+      <w:start w:val="1"/>
+      <w:numFmt w:val="bullet"/>
+      <w:lvlText w:val=""/>
+      <w:lvlJc w:val="left"/>
+      <w:pPr>
+        <w:ind w:left="2880" w:hanging="360"/>
+      </w:pPr>
+      <w:rPr>
+        <w:rFonts w:ascii="Symbol" w:hAnsi="Symbol" w:hint="default"/>
+      </w:rPr>
+    </w:lvl>
+    <w:lvl w:ilvl="4" w:tplc="08090003" w:tentative="1">
+      <w:start w:val="1"/>
+      <w:numFmt w:val="bullet"/>
+      <w:lvlText w:val="o"/>
+      <w:lvlJc w:val="left"/>
+      <w:pPr>
+        <w:ind w:left="3600" w:hanging="360"/>
+      </w:pPr>
+      <w:rPr>
+        <w:rFonts w:ascii="Courier New" w:hAnsi="Courier New" w:cs="Courier New" w:hint="default"/>
+      </w:rPr>
+    </w:lvl>
+    <w:lvl w:ilvl="5" w:tplc="08090005" w:tentative="1">
+      <w:start w:val="1"/>
+      <w:numFmt w:val="bullet"/>
+      <w:lvlText w:val=""/>
+      <w:lvlJc w:val="left"/>
+      <w:pPr>
+        <w:ind w:left="4320" w:hanging="360"/>
+      </w:pPr>
+      <w:rPr>
+        <w:rFonts w:ascii="Wingdings" w:hAnsi="Wingdings" w:hint="default"/>
+      </w:rPr>
+    </w:lvl>
+    <w:lvl w:ilvl="6" w:tplc="08090001" w:tentative="1">
+      <w:start w:val="1"/>
+      <w:numFmt w:val="bullet"/>
+      <w:lvlText w:val=""/>
+      <w:lvlJc w:val="left"/>
+      <w:pPr>
+        <w:ind w:left="5040" w:hanging="360"/>
+      </w:pPr>
+      <w:rPr>
+        <w:rFonts w:ascii="Symbol" w:hAnsi="Symbol" w:hint="default"/>
+      </w:rPr>
+    </w:lvl>
+    <w:lvl w:ilvl="7" w:tplc="08090003" w:tentative="1">
+      <w:start w:val="1"/>
+      <w:numFmt w:val="bullet"/>
+      <w:lvlText w:val="o"/>
+      <w:lvlJc w:val="left"/>
+      <w:pPr>
+        <w:ind w:left="5760" w:hanging="360"/>
+      </w:pPr>
+      <w:rPr>
+        <w:rFonts w:ascii="Courier New" w:hAnsi="Courier New" w:cs="Courier New" w:hint="default"/>
+      </w:rPr>
+    </w:lvl>
+    <w:lvl w:ilvl="8" w:tplc="08090005" w:tentative="1">
+      <w:start w:val="1"/>
+      <w:numFmt w:val="bullet"/>
+      <w:lvlText w:val=""/>
+      <w:lvlJc w:val="left"/>
+      <w:pPr>
+        <w:ind w:left="6480" w:hanging="360"/>
+      </w:pPr>
+      <w:rPr>
+        <w:rFonts w:ascii="Wingdings" w:hAnsi="Wingdings" w:hint="default"/>
+      </w:rPr>
+    </w:lvl>
+  </w:abstractNum>
+  <w:abstractNum w:abstractNumId="6" w15:restartNumberingAfterBreak="0">
     <w:nsid w:val="4C435A83"/>
     <w:multiLevelType w:val="hybridMultilevel"/>
     <w:tmpl w:val="5B9AA288"/>
@@ -4822,7 +5550,7 @@
       </w:rPr>
     </w:lvl>
   </w:abstractNum>
-  <w:abstractNum w:abstractNumId="6" w15:restartNumberingAfterBreak="0">
+  <w:abstractNum w:abstractNumId="7" w15:restartNumberingAfterBreak="0">
     <w:nsid w:val="4FD32221"/>
     <w:multiLevelType w:val="hybridMultilevel"/>
     <w:tmpl w:val="41C80464"/>
@@ -4935,7 +5663,7 @@
       </w:rPr>
     </w:lvl>
   </w:abstractNum>
-  <w:abstractNum w:abstractNumId="7" w15:restartNumberingAfterBreak="0">
+  <w:abstractNum w:abstractNumId="8" w15:restartNumberingAfterBreak="0">
     <w:nsid w:val="55736449"/>
     <w:multiLevelType w:val="hybridMultilevel"/>
     <w:tmpl w:val="F8881E9E"/>
@@ -5048,7 +5776,120 @@
       </w:rPr>
     </w:lvl>
   </w:abstractNum>
-  <w:abstractNum w:abstractNumId="8" w15:restartNumberingAfterBreak="0">
+  <w:abstractNum w:abstractNumId="9" w15:restartNumberingAfterBreak="0">
+    <w:nsid w:val="6C500078"/>
+    <w:multiLevelType w:val="hybridMultilevel"/>
+    <w:tmpl w:val="73D0736C"/>
+    <w:lvl w:ilvl="0" w:tplc="08090001">
+      <w:start w:val="1"/>
+      <w:numFmt w:val="bullet"/>
+      <w:lvlText w:val=""/>
+      <w:lvlJc w:val="left"/>
+      <w:pPr>
+        <w:ind w:left="720" w:hanging="360"/>
+      </w:pPr>
+      <w:rPr>
+        <w:rFonts w:ascii="Symbol" w:hAnsi="Symbol" w:hint="default"/>
+      </w:rPr>
+    </w:lvl>
+    <w:lvl w:ilvl="1" w:tplc="08090003">
+      <w:start w:val="1"/>
+      <w:numFmt w:val="bullet"/>
+      <w:lvlText w:val="o"/>
+      <w:lvlJc w:val="left"/>
+      <w:pPr>
+        <w:ind w:left="1440" w:hanging="360"/>
+      </w:pPr>
+      <w:rPr>
+        <w:rFonts w:ascii="Courier New" w:hAnsi="Courier New" w:cs="Courier New" w:hint="default"/>
+      </w:rPr>
+    </w:lvl>
+    <w:lvl w:ilvl="2" w:tplc="08090005" w:tentative="1">
+      <w:start w:val="1"/>
+      <w:numFmt w:val="bullet"/>
+      <w:lvlText w:val=""/>
+      <w:lvlJc w:val="left"/>
+      <w:pPr>
+        <w:ind w:left="2160" w:hanging="360"/>
+      </w:pPr>
+      <w:rPr>
+        <w:rFonts w:ascii="Wingdings" w:hAnsi="Wingdings" w:hint="default"/>
+      </w:rPr>
+    </w:lvl>
+    <w:lvl w:ilvl="3" w:tplc="08090001" w:tentative="1">
+      <w:start w:val="1"/>
+      <w:numFmt w:val="bullet"/>
+      <w:lvlText w:val=""/>
+      <w:lvlJc w:val="left"/>
+      <w:pPr>
+        <w:ind w:left="2880" w:hanging="360"/>
+      </w:pPr>
+      <w:rPr>
+        <w:rFonts w:ascii="Symbol" w:hAnsi="Symbol" w:hint="default"/>
+      </w:rPr>
+    </w:lvl>
+    <w:lvl w:ilvl="4" w:tplc="08090003" w:tentative="1">
+      <w:start w:val="1"/>
+      <w:numFmt w:val="bullet"/>
+      <w:lvlText w:val="o"/>
+      <w:lvlJc w:val="left"/>
+      <w:pPr>
+        <w:ind w:left="3600" w:hanging="360"/>
+      </w:pPr>
+      <w:rPr>
+        <w:rFonts w:ascii="Courier New" w:hAnsi="Courier New" w:cs="Courier New" w:hint="default"/>
+      </w:rPr>
+    </w:lvl>
+    <w:lvl w:ilvl="5" w:tplc="08090005" w:tentative="1">
+      <w:start w:val="1"/>
+      <w:numFmt w:val="bullet"/>
+      <w:lvlText w:val=""/>
+      <w:lvlJc w:val="left"/>
+      <w:pPr>
+        <w:ind w:left="4320" w:hanging="360"/>
+      </w:pPr>
+      <w:rPr>
+        <w:rFonts w:ascii="Wingdings" w:hAnsi="Wingdings" w:hint="default"/>
+      </w:rPr>
+    </w:lvl>
+    <w:lvl w:ilvl="6" w:tplc="08090001" w:tentative="1">
+      <w:start w:val="1"/>
+      <w:numFmt w:val="bullet"/>
+      <w:lvlText w:val=""/>
+      <w:lvlJc w:val="left"/>
+      <w:pPr>
+        <w:ind w:left="5040" w:hanging="360"/>
+      </w:pPr>
+      <w:rPr>
+        <w:rFonts w:ascii="Symbol" w:hAnsi="Symbol" w:hint="default"/>
+      </w:rPr>
+    </w:lvl>
+    <w:lvl w:ilvl="7" w:tplc="08090003" w:tentative="1">
+      <w:start w:val="1"/>
+      <w:numFmt w:val="bullet"/>
+      <w:lvlText w:val="o"/>
+      <w:lvlJc w:val="left"/>
+      <w:pPr>
+        <w:ind w:left="5760" w:hanging="360"/>
+      </w:pPr>
+      <w:rPr>
+        <w:rFonts w:ascii="Courier New" w:hAnsi="Courier New" w:cs="Courier New" w:hint="default"/>
+      </w:rPr>
+    </w:lvl>
+    <w:lvl w:ilvl="8" w:tplc="08090005" w:tentative="1">
+      <w:start w:val="1"/>
+      <w:numFmt w:val="bullet"/>
+      <w:lvlText w:val=""/>
+      <w:lvlJc w:val="left"/>
+      <w:pPr>
+        <w:ind w:left="6480" w:hanging="360"/>
+      </w:pPr>
+      <w:rPr>
+        <w:rFonts w:ascii="Wingdings" w:hAnsi="Wingdings" w:hint="default"/>
+      </w:rPr>
+    </w:lvl>
+  </w:abstractNum>
+  <w:abstractNum w:abstractNumId="10" w15:restartNumberingAfterBreak="0">
     <w:nsid w:val="6F641980"/>
     <w:multiLevelType w:val="hybridMultilevel"/>
     <w:tmpl w:val="504497F6"/>
@@ -5161,7 +6002,7 @@
       </w:rPr>
     </w:lvl>
   </w:abstractNum>
-  <w:abstractNum w:abstractNumId="9" w15:restartNumberingAfterBreak="0">
+  <w:abstractNum w:abstractNumId="11" w15:restartNumberingAfterBreak="0">
     <w:nsid w:val="72B022A4"/>
     <w:multiLevelType w:val="hybridMultilevel"/>
     <w:tmpl w:val="4614E998"/>
@@ -5274,7 +6115,7 @@
       </w:rPr>
     </w:lvl>
   </w:abstractNum>
-  <w:abstractNum w:abstractNumId="10" w15:restartNumberingAfterBreak="0">
+  <w:abstractNum w:abstractNumId="12" w15:restartNumberingAfterBreak="0">
     <w:nsid w:val="7991733E"/>
     <w:multiLevelType w:val="hybridMultilevel"/>
     <w:tmpl w:val="36EC521E"/>
@@ -5387,7 +6228,7 @@
       </w:rPr>
     </w:lvl>
   </w:abstractNum>
-  <w:abstractNum w:abstractNumId="11" w15:restartNumberingAfterBreak="0">
+  <w:abstractNum w:abstractNumId="13" w15:restartNumberingAfterBreak="0">
     <w:nsid w:val="7AB12E44"/>
     <w:multiLevelType w:val="hybridMultilevel"/>
     <w:tmpl w:val="D668E9FA"/>
@@ -5501,40 +6342,46 @@
     </w:lvl>
   </w:abstractNum>
   <w:num w:numId="1" w16cid:durableId="590313569">
-    <w:abstractNumId w:val="11"/>
+    <w:abstractNumId w:val="13"/>
   </w:num>
   <w:num w:numId="2" w16cid:durableId="2129539951">
-    <w:abstractNumId w:val="9"/>
+    <w:abstractNumId w:val="11"/>
   </w:num>
   <w:num w:numId="3" w16cid:durableId="450713011">
     <w:abstractNumId w:val="0"/>
   </w:num>
   <w:num w:numId="4" w16cid:durableId="1110706765">
-    <w:abstractNumId w:val="8"/>
+    <w:abstractNumId w:val="10"/>
   </w:num>
   <w:num w:numId="5" w16cid:durableId="1996755934">
-    <w:abstractNumId w:val="7"/>
+    <w:abstractNumId w:val="8"/>
   </w:num>
   <w:num w:numId="6" w16cid:durableId="378364287">
     <w:abstractNumId w:val="3"/>
   </w:num>
   <w:num w:numId="7" w16cid:durableId="8917818">
-    <w:abstractNumId w:val="5"/>
+    <w:abstractNumId w:val="6"/>
   </w:num>
   <w:num w:numId="8" w16cid:durableId="389695607">
-    <w:abstractNumId w:val="6"/>
+    <w:abstractNumId w:val="7"/>
   </w:num>
   <w:num w:numId="9" w16cid:durableId="530338465">
     <w:abstractNumId w:val="4"/>
   </w:num>
   <w:num w:numId="10" w16cid:durableId="1902670771">
-    <w:abstractNumId w:val="10"/>
+    <w:abstractNumId w:val="12"/>
   </w:num>
   <w:num w:numId="11" w16cid:durableId="785586271">
     <w:abstractNumId w:val="1"/>
   </w:num>
   <w:num w:numId="12" w16cid:durableId="404960596">
     <w:abstractNumId w:val="2"/>
+  </w:num>
+  <w:num w:numId="13" w16cid:durableId="1421874681">
+    <w:abstractNumId w:val="5"/>
+  </w:num>
+  <w:num w:numId="14" w16cid:durableId="923025758">
+    <w:abstractNumId w:val="9"/>
   </w:num>
 </w:numbering>
 </file>
@@ -6558,6 +7405,29 @@
       </w:tblBorders>
     </w:tblPr>
   </w:style>
+  <w:style w:type="character" w:styleId="Hyperlink">
+    <w:name w:val="Hyperlink"/>
+    <w:basedOn w:val="DefaultParagraphFont"/>
+    <w:uiPriority w:val="99"/>
+    <w:unhideWhenUsed/>
+    <w:rsid w:val="0058678F"/>
+    <w:rPr>
+      <w:color w:val="467886" w:themeColor="hyperlink"/>
+      <w:u w:val="single"/>
+    </w:rPr>
+  </w:style>
+  <w:style w:type="character" w:styleId="UnresolvedMention">
+    <w:name w:val="Unresolved Mention"/>
+    <w:basedOn w:val="DefaultParagraphFont"/>
+    <w:uiPriority w:val="99"/>
+    <w:semiHidden/>
+    <w:unhideWhenUsed/>
+    <w:rsid w:val="0058678F"/>
+    <w:rPr>
+      <w:color w:val="605E5C"/>
+      <w:shd w:val="clear" w:color="auto" w:fill="E1DFDD"/>
+    </w:rPr>
+  </w:style>
 </w:styles>
 </file>
 

</xml_diff>